<commit_message>
Fix SR Linux CLI command syntax in lab workbook
Correct arpnd and neighbor-discovery commands to use 'subinterface 0'
syntax instead of 'ethernet-1/1.0', and use 'info from state' for
route-table inspection.

Co-Authored-By: Claude Sonnet 4.6 (1M context) <noreply@anthropic.com>
</commit_message>
<xml_diff>
--- a/ipv4-vs-ipv6-lab-workbook.docx
+++ b/ipv4-vs-ipv6-lab-workbook.docx
@@ -5547,7 +5547,7 @@
           <w:szCs w:val="19"/>
           <w:rtl w:val="0"/>
         </w:rPr>
-        <w:t xml:space="preserve">show arpnd neighbors interface ethernet-1/1.0</w:t>
+        <w:t xml:space="preserve">show arpnd neighbors interface ethernet-1/1 subinterface 0</w:t>
       </w:r>
       <w:r>
         <w:rPr>
@@ -5575,7 +5575,7 @@
           <w:szCs w:val="19"/>
           <w:rtl w:val="0"/>
         </w:rPr>
-        <w:t xml:space="preserve"># (you can also browse:  info from state interface ethernet-1/1.0 ipv6 neighbor-discovery)</w:t>
+        <w:t xml:space="preserve"># (you can also browse:  info from state interface ethernet-1/1 subinterface 0 ipv6 neighbor-discovery)</w:t>
       </w:r>
       <w:r>
         <w:rPr>
@@ -6321,7 +6321,7 @@
           <w:szCs w:val="19"/>
           <w:rtl w:val="0"/>
         </w:rPr>
-        <w:t xml:space="preserve">show network-instance default route-table ipv6-unicast summary</w:t>
+        <w:t xml:space="preserve">show network-instance default ipv6 route summary</w:t>
       </w:r>
       <w:r>
         <w:rPr>
@@ -6674,87 +6674,128 @@
         <w:shd w:fill="f2f3f5" w:val="clear"/>
         <w:spacing w:after="0" w:before="0" w:lineRule="auto"/>
         <w:ind w:left="144" w:firstLine="0"/>
-        <w:rPr/>
-      </w:pPr>
-      <w:r>
         <w:rPr>
           <w:rFonts w:ascii="Consolas" w:cs="Consolas" w:eastAsia="Consolas" w:hAnsi="Consolas"/>
           <w:color w:val="14181f"/>
           <w:sz w:val="19"/>
           <w:szCs w:val="19"/>
+        </w:rPr>
+      </w:pPr>
+      <w:r>
+        <w:rPr>
+          <w:rFonts w:ascii="Consolas" w:cs="Consolas" w:eastAsia="Consolas" w:hAnsi="Consolas"/>
+          <w:color w:val="14181f"/>
+          <w:sz w:val="19"/>
+          <w:szCs w:val="19"/>
           <w:rtl w:val="0"/>
         </w:rPr>
         <w:t xml:space="preserve">enter candidate</w:t>
       </w:r>
-      <w:r>
-        <w:rPr>
-          <w:rtl w:val="0"/>
-        </w:rPr>
-      </w:r>
     </w:p>
     <w:p>
       <w:pPr>
         <w:shd w:fill="f2f3f5" w:val="clear"/>
         <w:spacing w:after="0" w:before="0" w:lineRule="auto"/>
         <w:ind w:left="144" w:firstLine="0"/>
-        <w:rPr/>
-      </w:pPr>
-      <w:r>
         <w:rPr>
           <w:rFonts w:ascii="Consolas" w:cs="Consolas" w:eastAsia="Consolas" w:hAnsi="Consolas"/>
           <w:color w:val="14181f"/>
           <w:sz w:val="19"/>
           <w:szCs w:val="19"/>
-          <w:rtl w:val="0"/>
-        </w:rPr>
-        <w:t xml:space="preserve">set / acl ipv6-filter block-ping entry 10 match icmp6 type echo-request</w:t>
-      </w:r>
-      <w:r>
-        <w:rPr>
-          <w:rtl w:val="0"/>
-        </w:rPr>
+        </w:rPr>
+      </w:pPr>
+      <w:r>
+        <w:rPr>
+          <w:rFonts w:ascii="Consolas" w:cs="Consolas" w:eastAsia="Consolas" w:hAnsi="Consolas"/>
+          <w:color w:val="14181f"/>
+          <w:sz w:val="19"/>
+          <w:szCs w:val="19"/>
+          <w:rtl w:val="0"/>
+        </w:rPr>
+        <w:t xml:space="preserve">set / acl acl-filter block-ping type ipv6 entry 10 match ipv6 next-header icmp6</w:t>
       </w:r>
     </w:p>
     <w:p>
       <w:pPr>
         <w:shd w:fill="f2f3f5" w:val="clear"/>
-        <w:spacing w:after="0" w:before="0" w:lineRule="auto"/>
+        <w:spacing w:after="0" w:lineRule="auto"/>
         <w:ind w:left="144" w:firstLine="0"/>
-        <w:rPr/>
-      </w:pPr>
-      <w:r>
         <w:rPr>
           <w:rFonts w:ascii="Consolas" w:cs="Consolas" w:eastAsia="Consolas" w:hAnsi="Consolas"/>
           <w:color w:val="14181f"/>
           <w:sz w:val="19"/>
           <w:szCs w:val="19"/>
-          <w:rtl w:val="0"/>
-        </w:rPr>
-        <w:t xml:space="preserve">set / acl ipv6-filter block-ping entry 10 action drop</w:t>
-      </w:r>
-      <w:r>
-        <w:rPr>
-          <w:rtl w:val="0"/>
-        </w:rPr>
+        </w:rPr>
+      </w:pPr>
+      <w:r>
+        <w:rPr>
+          <w:rFonts w:ascii="Consolas" w:cs="Consolas" w:eastAsia="Consolas" w:hAnsi="Consolas"/>
+          <w:color w:val="14181f"/>
+          <w:sz w:val="19"/>
+          <w:szCs w:val="19"/>
+          <w:rtl w:val="0"/>
+        </w:rPr>
+        <w:t xml:space="preserve">set / acl acl-filter block-ping type ipv6 entry 10 match ipv6 icmp6 type echo-request</w:t>
       </w:r>
     </w:p>
     <w:p>
       <w:pPr>
         <w:shd w:fill="f2f3f5" w:val="clear"/>
-        <w:spacing w:after="0" w:before="0" w:lineRule="auto"/>
+        <w:spacing w:after="0" w:lineRule="auto"/>
         <w:ind w:left="144" w:firstLine="0"/>
-        <w:rPr/>
-      </w:pPr>
-      <w:r>
         <w:rPr>
           <w:rFonts w:ascii="Consolas" w:cs="Consolas" w:eastAsia="Consolas" w:hAnsi="Consolas"/>
           <w:color w:val="14181f"/>
           <w:sz w:val="19"/>
           <w:szCs w:val="19"/>
-          <w:rtl w:val="0"/>
-        </w:rPr>
-        <w:t xml:space="preserve">set / acl ipv6-filter block-ping entry 100 action accept</w:t>
-      </w:r>
+        </w:rPr>
+      </w:pPr>
+      <w:r>
+        <w:rPr>
+          <w:rFonts w:ascii="Consolas" w:cs="Consolas" w:eastAsia="Consolas" w:hAnsi="Consolas"/>
+          <w:color w:val="14181f"/>
+          <w:sz w:val="19"/>
+          <w:szCs w:val="19"/>
+          <w:rtl w:val="0"/>
+        </w:rPr>
+        <w:t xml:space="preserve">set / acl acl-filter block-ping type ipv6 entry 10 action drop</w:t>
+      </w:r>
+    </w:p>
+    <w:p>
+      <w:pPr>
+        <w:shd w:fill="f2f3f5" w:val="clear"/>
+        <w:spacing w:after="0" w:lineRule="auto"/>
+        <w:ind w:left="144" w:firstLine="0"/>
+        <w:rPr>
+          <w:rFonts w:ascii="Consolas" w:cs="Consolas" w:eastAsia="Consolas" w:hAnsi="Consolas"/>
+          <w:color w:val="14181f"/>
+          <w:sz w:val="19"/>
+          <w:szCs w:val="19"/>
+        </w:rPr>
+      </w:pPr>
+      <w:r>
+        <w:rPr>
+          <w:rFonts w:ascii="Consolas" w:cs="Consolas" w:eastAsia="Consolas" w:hAnsi="Consolas"/>
+          <w:color w:val="14181f"/>
+          <w:sz w:val="19"/>
+          <w:szCs w:val="19"/>
+          <w:rtl w:val="0"/>
+        </w:rPr>
+        <w:t xml:space="preserve">set / acl acl-filter block-ping type ipv6 entry 100 action accept</w:t>
+      </w:r>
+    </w:p>
+    <w:p>
+      <w:pPr>
+        <w:shd w:fill="f2f3f5" w:val="clear"/>
+        <w:spacing w:after="0" w:lineRule="auto"/>
+        <w:ind w:left="144" w:firstLine="0"/>
+        <w:rPr>
+          <w:rFonts w:ascii="Consolas" w:cs="Consolas" w:eastAsia="Consolas" w:hAnsi="Consolas"/>
+          <w:color w:val="14181f"/>
+          <w:sz w:val="19"/>
+          <w:szCs w:val="19"/>
+        </w:rPr>
+      </w:pPr>
       <w:r>
         <w:rPr>
           <w:rtl w:val="0"/>
@@ -6801,7 +6842,7 @@
           <w:szCs w:val="19"/>
           <w:rtl w:val="0"/>
         </w:rPr>
-        <w:t xml:space="preserve">set / acl interface ethernet-1/1.0 input ipv6-filter block-ping</w:t>
+        <w:t xml:space="preserve">set / acl interface ethernet-1/1.0 input acl-filter block-ping type ipv6 first</w:t>
       </w:r>
       <w:r>
         <w:rPr>
@@ -8235,7 +8276,7 @@
                 <w:szCs w:val="18"/>
                 <w:rtl w:val="0"/>
               </w:rPr>
-              <w:t xml:space="preserve">show network-instance default route-table ipv6-unicast summary</w:t>
+              <w:t xml:space="preserve">show network-instance default ipv6 route summary</w:t>
             </w:r>
             <w:r>
               <w:rPr>

</xml_diff>

<commit_message>
Enable lo0 subinterface admin-state to match lab workbook
Add ipv4/ipv6 admin-state enable on the lo0 subinterface in srl1.cli
and srl2.cli so the answer-key configs match the updated Step 5
commands in the lab workbook. Also updates the workbook docx/pdf.

Co-Authored-By: Claude Opus 4.8 (1M context) <noreply@anthropic.com>
</commit_message>
<xml_diff>
--- a/ipv4-vs-ipv6-lab-workbook.docx
+++ b/ipv4-vs-ipv6-lab-workbook.docx
@@ -5769,22 +5769,47 @@
         <w:shd w:fill="f2f3f5" w:val="clear"/>
         <w:spacing w:after="0" w:before="0" w:lineRule="auto"/>
         <w:ind w:left="144" w:firstLine="0"/>
-        <w:rPr/>
-      </w:pPr>
-      <w:r>
         <w:rPr>
           <w:rFonts w:ascii="Consolas" w:cs="Consolas" w:eastAsia="Consolas" w:hAnsi="Consolas"/>
           <w:color w:val="14181f"/>
           <w:sz w:val="19"/>
           <w:szCs w:val="19"/>
-          <w:rtl w:val="0"/>
-        </w:rPr>
+        </w:rPr>
+      </w:pPr>
+      <w:r>
+        <w:rPr>
+          <w:rFonts w:ascii="Consolas" w:cs="Consolas" w:eastAsia="Consolas" w:hAnsi="Consolas"/>
+          <w:color w:val="14181f"/>
+          <w:sz w:val="19"/>
+          <w:szCs w:val="19"/>
+          <w:rtl w:val="0"/>
+        </w:rPr>
+        <w:t xml:space="preserve">set / interface lo0 subinterface 0 ipv4 admin-state enable</w:t>
+        <w:br w:type="textWrapping"/>
         <w:t xml:space="preserve">set / interface lo0 subinterface 0 ipv4 address 10.1.1.1/24</w:t>
       </w:r>
-      <w:r>
-        <w:rPr>
-          <w:rtl w:val="0"/>
-        </w:rPr>
+    </w:p>
+    <w:p>
+      <w:pPr>
+        <w:shd w:fill="f2f3f5" w:val="clear"/>
+        <w:spacing w:after="0" w:before="0" w:lineRule="auto"/>
+        <w:ind w:left="144" w:firstLine="0"/>
+        <w:rPr>
+          <w:rFonts w:ascii="Consolas" w:cs="Consolas" w:eastAsia="Consolas" w:hAnsi="Consolas"/>
+          <w:color w:val="14181f"/>
+          <w:sz w:val="19"/>
+          <w:szCs w:val="19"/>
+        </w:rPr>
+      </w:pPr>
+      <w:r>
+        <w:rPr>
+          <w:rFonts w:ascii="Consolas" w:cs="Consolas" w:eastAsia="Consolas" w:hAnsi="Consolas"/>
+          <w:color w:val="14181f"/>
+          <w:sz w:val="19"/>
+          <w:szCs w:val="19"/>
+          <w:rtl w:val="0"/>
+        </w:rPr>
+        <w:t xml:space="preserve">set / interface lo0 subinterface 0 ipv6 admin-state enable</w:t>
       </w:r>
     </w:p>
     <w:p>
@@ -6050,6 +6075,8 @@
           <w:rtl w:val="0"/>
         </w:rPr>
         <w:t xml:space="preserve">enter candidate</w:t>
+        <w:br w:type="textWrapping"/>
+        <w:t xml:space="preserve">set / interface lo0 subinterface 0 ipv4 admin-state enable</w:t>
       </w:r>
       <w:r>
         <w:rPr>
@@ -6073,6 +6100,8 @@
           <w:rtl w:val="0"/>
         </w:rPr>
         <w:t xml:space="preserve">set / interface lo0 subinterface 0 ipv4 address 10.2.2.1/24</w:t>
+        <w:br w:type="textWrapping"/>
+        <w:t xml:space="preserve">set / interface lo0 subinterface 0 ipv6 admin-state enable</w:t>
       </w:r>
       <w:r>
         <w:rPr>

</xml_diff>